<commit_message>
sửa thông tin contact
</commit_message>
<xml_diff>
--- a/docs/báo cáo tiến độ.docx
+++ b/docs/báo cáo tiến độ.docx
@@ -6345,29 +6345,7 @@
           <w:sz w:val="24"/>
           <w:szCs w:val="24"/>
         </w:rPr>
-        <w:t>4.1.</w:t>
-      </w:r>
-      <w:r>
-        <w:rPr>
-          <w:rFonts w:ascii="Times New Roman" w:eastAsia="Times New Roman" w:hAnsi="Times New Roman" w:cs="Times New Roman"/>
-          <w:b/>
-          <w:bCs/>
-          <w:color w:val="auto"/>
-          <w:sz w:val="24"/>
-          <w:szCs w:val="24"/>
-        </w:rPr>
-        <w:t>2</w:t>
-      </w:r>
-      <w:r>
-        <w:rPr>
-          <w:rFonts w:ascii="Times New Roman" w:eastAsia="Times New Roman" w:hAnsi="Times New Roman" w:cs="Times New Roman"/>
-          <w:b/>
-          <w:bCs/>
-          <w:color w:val="auto"/>
-          <w:sz w:val="24"/>
-          <w:szCs w:val="24"/>
-        </w:rPr>
-        <w:t>. Công nghệ sử dụng</w:t>
+        <w:t>4.1.2. Công nghệ sử dụng</w:t>
       </w:r>
       <w:bookmarkEnd w:id="18"/>
       <w:bookmarkEnd w:id="19"/>
@@ -8211,15 +8189,7 @@
                 <w:sz w:val="24"/>
                 <w:szCs w:val="24"/>
               </w:rPr>
-              <w:t xml:space="preserve">Tháng </w:t>
-            </w:r>
-            <w:r>
-              <w:rPr>
-                <w:rFonts w:ascii="Times New Roman" w:hAnsi="Times New Roman"/>
-                <w:sz w:val="24"/>
-                <w:szCs w:val="24"/>
-              </w:rPr>
-              <w:t>10</w:t>
+              <w:t>Tháng</w:t>
             </w:r>
             <w:r>
               <w:rPr>
@@ -8228,7 +8198,7 @@
                 <w:szCs w:val="24"/>
                 <w:lang w:val="vi-VN"/>
               </w:rPr>
-              <w:t>-11</w:t>
+              <w:t xml:space="preserve"> 9</w:t>
             </w:r>
           </w:p>
         </w:tc>
@@ -8242,6 +8212,7 @@
                 <w:rFonts w:ascii="Times New Roman" w:hAnsi="Times New Roman"/>
                 <w:sz w:val="24"/>
                 <w:szCs w:val="24"/>
+                <w:lang w:val="vi-VN"/>
               </w:rPr>
             </w:pPr>
             <w:r>
@@ -8250,7 +8221,16 @@
                 <w:sz w:val="24"/>
                 <w:szCs w:val="24"/>
               </w:rPr>
-              <w:t>Hoàn thiện kiểm thử toàn diện theo từng use case, kiểm thử thực nghiệm thuật toán sinh mã đề; xin ý kiến đánh giá từ Phòng CNTT - Z176</w:t>
+              <w:t>Phát</w:t>
+            </w:r>
+            <w:r>
+              <w:rPr>
+                <w:rFonts w:ascii="Times New Roman" w:hAnsi="Times New Roman"/>
+                <w:sz w:val="24"/>
+                <w:szCs w:val="24"/>
+                <w:lang w:val="vi-VN"/>
+              </w:rPr>
+              <w:t xml:space="preserve"> triển và hoàn thiện các chức năng cơ bản của 4 quyền, kiểm tra và xử lý logic nghiệp vụ của từng chức năng</w:t>
             </w:r>
           </w:p>
         </w:tc>
@@ -8264,6 +8244,7 @@
                 <w:rFonts w:ascii="Times New Roman" w:hAnsi="Times New Roman"/>
                 <w:sz w:val="24"/>
                 <w:szCs w:val="24"/>
+                <w:lang w:val="vi-VN"/>
               </w:rPr>
             </w:pPr>
             <w:r>
@@ -8272,7 +8253,16 @@
                 <w:sz w:val="24"/>
                 <w:szCs w:val="24"/>
               </w:rPr>
-              <w:t>Hệ thống được kiểm thử đầy đủ, xác nhận tính đúng đắn và công bằng của thuật toán sinh mã đề</w:t>
+              <w:t>Hoạt</w:t>
+            </w:r>
+            <w:r>
+              <w:rPr>
+                <w:rFonts w:ascii="Times New Roman" w:hAnsi="Times New Roman"/>
+                <w:sz w:val="24"/>
+                <w:szCs w:val="24"/>
+                <w:lang w:val="vi-VN"/>
+              </w:rPr>
+              <w:t xml:space="preserve"> động đúng logic nghiệp vụ công ty đã giao</w:t>
             </w:r>
           </w:p>
         </w:tc>
@@ -8288,6 +8278,7 @@
                 <w:rFonts w:ascii="Times New Roman" w:hAnsi="Times New Roman"/>
                 <w:sz w:val="24"/>
                 <w:szCs w:val="24"/>
+                <w:lang w:val="vi-VN"/>
               </w:rPr>
             </w:pPr>
             <w:r>
@@ -8296,7 +8287,24 @@
                 <w:sz w:val="24"/>
                 <w:szCs w:val="24"/>
               </w:rPr>
-              <w:t>Đầu tháng 12</w:t>
+              <w:t xml:space="preserve">Tháng </w:t>
+            </w:r>
+            <w:r>
+              <w:rPr>
+                <w:rFonts w:ascii="Times New Roman" w:hAnsi="Times New Roman"/>
+                <w:sz w:val="24"/>
+                <w:szCs w:val="24"/>
+              </w:rPr>
+              <w:t>10</w:t>
+            </w:r>
+            <w:r>
+              <w:rPr>
+                <w:rFonts w:ascii="Times New Roman" w:hAnsi="Times New Roman"/>
+                <w:sz w:val="24"/>
+                <w:szCs w:val="24"/>
+                <w:lang w:val="vi-VN"/>
+              </w:rPr>
+              <w:t>-11</w:t>
             </w:r>
           </w:p>
         </w:tc>
@@ -8318,7 +8326,7 @@
                 <w:sz w:val="24"/>
                 <w:szCs w:val="24"/>
               </w:rPr>
-              <w:t>Hoàn thiện nội dung quyển báo cáo khóa luận tốt nghiệp</w:t>
+              <w:t>Hoàn thiện kiểm thử toàn diện theo từng use case, kiểm thử thực nghiệm thuật toán sinh mã đề; xin ý kiến đánh giá từ Phòng CNTT - Z176</w:t>
             </w:r>
           </w:p>
         </w:tc>
@@ -8340,7 +8348,7 @@
                 <w:sz w:val="24"/>
                 <w:szCs w:val="24"/>
               </w:rPr>
-              <w:t>Quyển báo cáo khóa luận hoàn chỉnh</w:t>
+              <w:t>Hệ thống được kiểm thử đầy đủ, xác nhận tính đúng đắn và công bằng của thuật toán sinh mã đề</w:t>
             </w:r>
           </w:p>
         </w:tc>
@@ -8364,7 +8372,7 @@
                 <w:sz w:val="24"/>
                 <w:szCs w:val="24"/>
               </w:rPr>
-              <w:t>Giữa - cuối tháng 12</w:t>
+              <w:t>Đầu tháng 12</w:t>
             </w:r>
           </w:p>
         </w:tc>
@@ -8386,7 +8394,7 @@
                 <w:sz w:val="24"/>
                 <w:szCs w:val="24"/>
               </w:rPr>
-              <w:t>Chuẩn bị slide, tổng duyệt và bảo vệ khóa luận trước hội đồng</w:t>
+              <w:t>Hoàn thiện nội dung quyển báo cáo khóa luận tốt nghiệp</w:t>
             </w:r>
           </w:p>
         </w:tc>
@@ -8408,6 +8416,74 @@
                 <w:sz w:val="24"/>
                 <w:szCs w:val="24"/>
               </w:rPr>
+              <w:t>Quyển báo cáo khóa luận hoàn chỉnh</w:t>
+            </w:r>
+          </w:p>
+        </w:tc>
+      </w:tr>
+      <w:tr>
+        <w:tc>
+          <w:tcPr>
+            <w:tcW w:w="3080" w:type="dxa"/>
+          </w:tcPr>
+          <w:p>
+            <w:pPr>
+              <w:rPr>
+                <w:rFonts w:ascii="Times New Roman" w:hAnsi="Times New Roman"/>
+                <w:sz w:val="24"/>
+                <w:szCs w:val="24"/>
+              </w:rPr>
+            </w:pPr>
+            <w:r>
+              <w:rPr>
+                <w:rFonts w:ascii="Times New Roman" w:hAnsi="Times New Roman"/>
+                <w:sz w:val="24"/>
+                <w:szCs w:val="24"/>
+              </w:rPr>
+              <w:t>Giữa - cuối tháng 12</w:t>
+            </w:r>
+          </w:p>
+        </w:tc>
+        <w:tc>
+          <w:tcPr>
+            <w:tcW w:w="3081" w:type="dxa"/>
+          </w:tcPr>
+          <w:p>
+            <w:pPr>
+              <w:rPr>
+                <w:rFonts w:ascii="Times New Roman" w:hAnsi="Times New Roman"/>
+                <w:sz w:val="24"/>
+                <w:szCs w:val="24"/>
+              </w:rPr>
+            </w:pPr>
+            <w:r>
+              <w:rPr>
+                <w:rFonts w:ascii="Times New Roman" w:hAnsi="Times New Roman"/>
+                <w:sz w:val="24"/>
+                <w:szCs w:val="24"/>
+              </w:rPr>
+              <w:t>Chuẩn bị slide, tổng duyệt và bảo vệ khóa luận trước hội đồng</w:t>
+            </w:r>
+          </w:p>
+        </w:tc>
+        <w:tc>
+          <w:tcPr>
+            <w:tcW w:w="3081" w:type="dxa"/>
+          </w:tcPr>
+          <w:p>
+            <w:pPr>
+              <w:rPr>
+                <w:rFonts w:ascii="Times New Roman" w:hAnsi="Times New Roman"/>
+                <w:sz w:val="24"/>
+                <w:szCs w:val="24"/>
+              </w:rPr>
+            </w:pPr>
+            <w:r>
+              <w:rPr>
+                <w:rFonts w:ascii="Times New Roman" w:hAnsi="Times New Roman"/>
+                <w:sz w:val="24"/>
+                <w:szCs w:val="24"/>
+              </w:rPr>
               <w:t>Slide và sản phẩm sẵn sàng để bảo vệ khóa luận</w:t>
             </w:r>
           </w:p>
@@ -8451,7 +8527,7 @@
           <w:lang w:val="vi-VN"/>
         </w:rPr>
       </w:pPr>
-      <w:hyperlink r:id="rId19" w:history="1">
+      <w:hyperlink r:id="rId19" w:anchor="gid=945917388" w:history="1">
         <w:r>
           <w:rPr>
             <w:rStyle w:val="Hyperlink"/>
@@ -8515,46 +8591,6 @@
         </w:rPr>
         <w:t>https://github.com/duong218/Z176</w:t>
       </w:r>
-    </w:p>
-    <w:p>
-      <w:pPr>
-        <w:rPr>
-          <w:rFonts w:ascii="Times New Roman" w:hAnsi="Times New Roman"/>
-          <w:lang w:val="vi-VN"/>
-        </w:rPr>
-      </w:pPr>
-    </w:p>
-    <w:p>
-      <w:pPr>
-        <w:rPr>
-          <w:rFonts w:ascii="Times New Roman" w:hAnsi="Times New Roman"/>
-          <w:lang w:val="vi-VN"/>
-        </w:rPr>
-      </w:pPr>
-    </w:p>
-    <w:p>
-      <w:pPr>
-        <w:rPr>
-          <w:rFonts w:ascii="Times New Roman" w:hAnsi="Times New Roman"/>
-          <w:lang w:val="vi-VN"/>
-        </w:rPr>
-      </w:pPr>
-    </w:p>
-    <w:p>
-      <w:pPr>
-        <w:rPr>
-          <w:rFonts w:ascii="Times New Roman" w:hAnsi="Times New Roman"/>
-          <w:lang w:val="vi-VN"/>
-        </w:rPr>
-      </w:pPr>
-    </w:p>
-    <w:p>
-      <w:pPr>
-        <w:rPr>
-          <w:rFonts w:ascii="Times New Roman" w:hAnsi="Times New Roman"/>
-          <w:lang w:val="vi-VN"/>
-        </w:rPr>
-      </w:pPr>
     </w:p>
     <w:p>
       <w:pPr>
@@ -10558,6 +10594,7 @@
   <w:style w:type="character" w:default="1" w:styleId="DefaultParagraphFont">
     <w:name w:val="Default Paragraph Font"/>
     <w:uiPriority w:val="1"/>
+    <w:semiHidden/>
     <w:unhideWhenUsed/>
   </w:style>
   <w:style w:type="table" w:default="1" w:styleId="TableNormal">

</xml_diff>